<commit_message>
Update Q&A document to include source-filtering guidance and correct question count
</commit_message>
<xml_diff>
--- a/vRLI Domain Migration and Enable LB Questions-Answers.docx
+++ b/vRLI Domain Migration and Enable LB Questions-Answers.docx
@@ -29,7 +29,7 @@
           <w:sz w:val="28"/>
           <w:szCs w:val="28"/>
         </w:rPr>
-        <w:t xml:space="preserve">Domain Migration, Load Balancer &amp; Scaling Q&amp;A</w:t>
+        <w:t xml:space="preserve">Domain Migration, Load Balancer, Scaling &amp; Source-Filtering Q&amp;A</w:t>
       </w:r>
     </w:p>
     <w:p>
@@ -54,7 +54,7 @@
         <w:spacing w:after="120"/>
       </w:pPr>
       <w:r>
-        <w:t xml:space="preserve">This document answers five customer questions for a forced domain-migration project on a 3-node Aria Operations for Logs 8.18 cluster. All guidance below is drawn from current Broadcom TechDocs and Knowledge Base articles. Reference URLs are embedded inline next to each answer and step.</w:t>
+        <w:t xml:space="preserve">This document answers six customer questions for a forced domain-migration project on a 3-node Aria Operations for Logs 8.18 cluster. All guidance below is drawn from current Broadcom TechDocs and Knowledge Base articles. Reference URLs are embedded inline next to each answer and step.</w:t>
       </w:r>
     </w:p>
     <w:p>
@@ -90,7 +90,7 @@
       <w:r>
         <w:t xml:space="preserve">Reference: </w:t>
       </w:r>
-      <w:hyperlink w:history="1" r:id="rIdrctzwznvt2s83gjf7matq">
+      <w:hyperlink w:history="1" r:id="rIduricsc1v55k9oqwpc9raq">
         <w:r>
           <w:rPr>
             <w:rStyle w:val="Hyperlink"/>
@@ -129,7 +129,7 @@
       <w:r>
         <w:t xml:space="preserve">Create new forward (A) and reverse (PTR) DNS records for every node and the ILB VIP before changing anything. Keep the old A/PTR records in place during cutover so existing sources continue to resolve. Reference: </w:t>
       </w:r>
-      <w:hyperlink w:history="1" r:id="rIdy_obo8e9z4kt9zlocngi7">
+      <w:hyperlink w:history="1" r:id="rIdvgg55doirjub6ljpuhct6">
         <w:r>
           <w:rPr>
             <w:rStyle w:val="Hyperlink"/>
@@ -179,7 +179,7 @@
       <w:r>
         <w:t xml:space="preserve">Run hostnamectl set-hostname &lt;new-FQDN&gt; on each node, and ensure the vApp "hostname" property is set in vCenter so it persists across reboots. References: </w:t>
       </w:r>
-      <w:hyperlink w:history="1" r:id="rIdh7jsfjyg8lgzm7qbds0q2">
+      <w:hyperlink w:history="1" r:id="rIdtefwpfl3yahj1xydfhf8s">
         <w:r>
           <w:rPr>
             <w:rStyle w:val="Hyperlink"/>
@@ -192,7 +192,7 @@
       <w:r>
         <w:t xml:space="preserve"> and </w:t>
       </w:r>
-      <w:hyperlink w:history="1" r:id="rIdk-5kngbk0zxtpeuvbztq6">
+      <w:hyperlink w:history="1" r:id="rIdjnrstemrbfprei-f7wkxs">
         <w:r>
           <w:rPr>
             <w:rStyle w:val="Hyperlink"/>
@@ -222,7 +222,7 @@
       <w:r>
         <w:t xml:space="preserve">Edit /etc/systemd/network/10-eth0.network to update DNS= and Domains= entries, then restart systemd-networkd and systemd-resolved. Repeat one node at a time, performing the node that currently owns the ILB last. Reference: </w:t>
       </w:r>
-      <w:hyperlink w:history="1" r:id="rIdffrfavmzypoxxjlholgpu">
+      <w:hyperlink w:history="1" r:id="rIdwxowl1oimkzu1fp4xkjsl">
         <w:r>
           <w:rPr>
             <w:rStyle w:val="Hyperlink"/>
@@ -252,7 +252,7 @@
       <w:r>
         <w:t xml:space="preserve">Browse to https://&lt;primary_FQDN&gt;/internal/config, locate the &lt;distributed overwrite-children="true"&gt; section, and in each &lt;daemon&gt; block replace the host field with the new FQDN, then save. Reference: </w:t>
       </w:r>
-      <w:hyperlink w:history="1" r:id="rIdxx_hcmw0qmfqsj8_ni3qm">
+      <w:hyperlink w:history="1" r:id="rIdpxrd3lgevs7uki8kglz3a">
         <w:r>
           <w:rPr>
             <w:rStyle w:val="Hyperlink"/>
@@ -302,7 +302,7 @@
       <w:r>
         <w:t xml:space="preserve">Re-point vSphere integration, Aria Operations integration, SMTP, AD/SSO, and any forwarders. The vCenter integration sometimes caches the old FQDN and needs to be removed and re-added. Reference: </w:t>
       </w:r>
-      <w:hyperlink w:history="1" r:id="rIdmvnqwvvyjzqpvmsblca_k">
+      <w:hyperlink w:history="1" r:id="rIdqs3u1heode7gzomzxehie">
         <w:r>
           <w:rPr>
             <w:rStyle w:val="Hyperlink"/>
@@ -354,7 +354,7 @@
       <w:r>
         <w:t xml:space="preserve">The primary node's FQDN is embedded in every worker's join configuration. If the primary FQDN string itself is changing (new domain suffix), the config files on every node must be updated as in step 5 above. Reference: </w:t>
       </w:r>
-      <w:hyperlink w:history="1" r:id="rIdan43u7xfmadt26tofrklc">
+      <w:hyperlink w:history="1" r:id="rIdxbr9vjp4a20fwv32ebfyk">
         <w:r>
           <w:rPr>
             <w:rStyle w:val="Hyperlink"/>
@@ -377,7 +377,7 @@
       <w:r>
         <w:t xml:space="preserve">Broadcom guidance is to engage Support for primary-node procedures — they differ from worker procedures. Reference: </w:t>
       </w:r>
-      <w:hyperlink w:history="1" r:id="rIdyauo_4ehbflq1-iysxojq">
+      <w:hyperlink w:history="1" r:id="rIdsm2zxkt9ji9--9qdkwcyv">
         <w:r>
           <w:rPr>
             <w:rStyle w:val="Hyperlink"/>
@@ -447,7 +447,7 @@
       <w:r>
         <w:t xml:space="preserve">The ILB is a floating virtual IP (vIP) owned by one node at a time, using a Direct Server Return (DSR) design. Incoming traffic passes through the current ILB owner; return traffic goes from the responding node directly back to the client. Up to 60 vIPs are supported. Reference: </w:t>
       </w:r>
-      <w:hyperlink w:history="1" r:id="rIdliyvgvryj2u4gl4gzsda2">
+      <w:hyperlink w:history="1" r:id="rId2yffw7buerqxjbfpbe_qu">
         <w:r>
           <w:rPr>
             <w:rStyle w:val="Hyperlink"/>
@@ -513,7 +513,7 @@
       <w:r>
         <w:t xml:space="preserve">Best practice is to point clients at an FQDN that resolves to the ILB IP, not at the raw IP. vSphere, Aria Operations integrations, and alert messages use the FQDN if provided. Reference: </w:t>
       </w:r>
-      <w:hyperlink w:history="1" r:id="rIdxpu6jnmccj-hqlmil9jqp">
+      <w:hyperlink w:history="1" r:id="rIdxmlsaenxrk8z-owptftov">
         <w:r>
           <w:rPr>
             <w:rStyle w:val="Hyperlink"/>
@@ -536,7 +536,7 @@
       <w:r>
         <w:t xml:space="preserve">Operational note: do not retire the primary node FQDN — manual upgrades must be performed against the primary FQDN, NOT the ILB IP. Reference: </w:t>
       </w:r>
-      <w:hyperlink w:history="1" r:id="rIdvp_pv81z3krzub_wha77q">
+      <w:hyperlink w:history="1" r:id="rId0r7dloomkf90udrcbfdxo">
         <w:r>
           <w:rPr>
             <w:rStyle w:val="Hyperlink"/>
@@ -611,7 +611,7 @@
       <w:r>
         <w:t xml:space="preserve">Per-node total addressable storage: 4 TB (+ OS drive). Reference: </w:t>
       </w:r>
-      <w:hyperlink w:history="1" r:id="rId5b2t108q0uj63o-cptddm">
+      <w:hyperlink w:history="1" r:id="rIdvlszdly1uqxgakcsgfiqs">
         <w:r>
           <w:rPr>
             <w:rStyle w:val="Hyperlink"/>
@@ -664,7 +664,7 @@
       <w:r>
         <w:t xml:space="preserve">When a node hits 4 TB, you must scale out to additional nodes — adding more disks beyond 4 TB on an existing node is not supported. Reference: </w:t>
       </w:r>
-      <w:hyperlink w:history="1" r:id="rId_p3unmtmi4uryqckzxafm">
+      <w:hyperlink w:history="1" r:id="rIdjrwx7ulj9n8watne_ioet">
         <w:r>
           <w:rPr>
             <w:rStyle w:val="Hyperlink"/>
@@ -677,7 +677,7 @@
       <w:r>
         <w:t xml:space="preserve"> and </w:t>
       </w:r>
-      <w:hyperlink w:history="1" r:id="rId5vq8a_cbz3wnogsp2glk-">
+      <w:hyperlink w:history="1" r:id="rIdildg5hb-jwwqys6obytrd">
         <w:r>
           <w:rPr>
             <w:rStyle w:val="Hyperlink"/>
@@ -736,7 +736,7 @@
       <w:r>
         <w:t xml:space="preserve">Anything older goes to NFS archive. Archived logs are NOT searchable in place — they are raw compressed bucket files. To query archived data, you must import it back into a (typically separate) Aria Operations for Logs instance, which is slow and operationally heavy. Reference: </w:t>
       </w:r>
-      <w:hyperlink w:history="1" r:id="rIdzv2nrzgswnhxnu9q-l4tb">
+      <w:hyperlink w:history="1" r:id="rId4nlqla8dz1gqg9idqdtkp">
         <w:r>
           <w:rPr>
             <w:rStyle w:val="Hyperlink"/>
@@ -766,7 +766,7 @@
       <w:r>
         <w:t xml:space="preserve">8.18 supports up to 10 index partitions, each with its own retention period and NFS archive target. This lets you keep noisy sources for short periods and critical sources for longer, on the same cluster. Reference: </w:t>
       </w:r>
-      <w:hyperlink w:history="1" r:id="rIdiinvo03jh-biyvshl4kok">
+      <w:hyperlink w:history="1" r:id="rIdtxepdok8is9gj8v3x1_fb">
         <w:r>
           <w:rPr>
             <w:rStyle w:val="Hyperlink"/>
@@ -840,7 +840,7 @@
       <w:r>
         <w:t xml:space="preserve">IOPS matters significantly. A Large node is rated for 1,500 IOPS in the official sizing table; underlying datastore IOPS is the most common bottleneck on large queries. Reference: </w:t>
       </w:r>
-      <w:hyperlink w:history="1" r:id="rIdlsi3fbz9_jmfjfvuisemp">
+      <w:hyperlink w:history="1" r:id="rIduglx93ehpo7ryuhbyixki">
         <w:r>
           <w:rPr>
             <w:rStyle w:val="Hyperlink"/>
@@ -876,7 +876,7 @@
       <w:r>
         <w:t xml:space="preserve">8.18 specifically improved this — the release notes call out that the performance of queries containing filters with regex-based extracted fields is optimized — but it is still optimization on top of a hot-index design that is not built to interactively scan 60 TB. Reference: </w:t>
       </w:r>
-      <w:hyperlink w:history="1" r:id="rIdfjhoas8ihb5rq2tgobivy">
+      <w:hyperlink w:history="1" r:id="rIdpxxmt1julsnoqfhxodwbk">
         <w:r>
           <w:rPr>
             <w:rStyle w:val="Hyperlink"/>
@@ -1021,7 +1021,7 @@
       <w:r>
         <w:t xml:space="preserve">Per Broadcom, EPS scales linearly with node count. An 18-node cluster delivers 270,000 EPS or about 4 TB of events per day. Reference: </w:t>
       </w:r>
-      <w:hyperlink w:history="1" r:id="rId437xpa_18w1kapemxmdwr">
+      <w:hyperlink w:history="1" r:id="rIdhdqbu5t0ntw-eu9yz-nmj">
         <w:r>
           <w:rPr>
             <w:rStyle w:val="Hyperlink"/>
@@ -1060,7 +1060,7 @@
       <w:r>
         <w:t xml:space="preserve">with the actual EPS, daily GB ingest, and required hot-retention days. This is the only Broadcom-supported way to right-size. References: </w:t>
       </w:r>
-      <w:hyperlink w:history="1" r:id="rIdpkvz_ekki-2naokclbtzb">
+      <w:hyperlink w:history="1" r:id="rIdsx-ehqqfhxea4qqwasnxc">
         <w:r>
           <w:rPr>
             <w:rStyle w:val="Hyperlink"/>
@@ -1073,7 +1073,7 @@
       <w:r>
         <w:t xml:space="preserve"> and the web tool: </w:t>
       </w:r>
-      <w:hyperlink w:history="1" r:id="rIdo_-8mwnopbblmxfbnd8mj">
+      <w:hyperlink w:history="1" r:id="rIddun5z5s1-wouqvom8c4to">
         <w:r>
           <w:rPr>
             <w:rStyle w:val="Hyperlink"/>
@@ -1123,7 +1123,7 @@
       <w:r>
         <w:t xml:space="preserve">or vertical scaling on existing nodes where supported. References: </w:t>
       </w:r>
-      <w:hyperlink w:history="1" r:id="rIdkc1ezdosanbqsqoo3-1iq">
+      <w:hyperlink w:history="1" r:id="rIdp0qk2oy3nldoaof0qfiio">
         <w:r>
           <w:rPr>
             <w:rStyle w:val="Hyperlink"/>
@@ -1136,7 +1136,7 @@
       <w:r>
         <w:t xml:space="preserve"> and </w:t>
       </w:r>
-      <w:hyperlink w:history="1" r:id="rIdszyjwp6qkz4mq1axxuzrf">
+      <w:hyperlink w:history="1" r:id="rIdho4fockc5i4xm2g1sjp7d">
         <w:r>
           <w:rPr>
             <w:rStyle w:val="Hyperlink"/>
@@ -1193,7 +1193,7 @@
         <w:spacing w:after="160" w:before="280"/>
       </w:pPr>
       <w:r>
-        <w:t xml:space="preserve">Consolidated reference list</w:t>
+        <w:t xml:space="preserve">6) Preventing logs from unwanted sources at the appliance end</w:t>
       </w:r>
     </w:p>
     <w:p>
@@ -1202,208 +1202,28 @@
         <w:spacing w:after="120" w:before="220"/>
       </w:pPr>
       <w:r>
-        <w:t xml:space="preserve">Aria Operations for Logs 8.18 — official documentation</w:t>
-      </w:r>
-    </w:p>
-    <w:p>
-      <w:pPr>
-        <w:pStyle w:val="ListParagraph"/>
-        <w:numPr>
-          <w:ilvl w:val="0"/>
-          <w:numId w:val="3"/>
-        </w:numPr>
-        <w:spacing w:after="80"/>
-      </w:pPr>
-      <w:hyperlink w:history="1" r:id="rId5oer6kxjacvq2owcgu4ik">
-        <w:r>
-          <w:rPr>
-            <w:rStyle w:val="Hyperlink"/>
-            <w:color w:val="0563C1"/>
-            <w:u w:val="single"/>
-          </w:rPr>
-          <w:t xml:space="preserve">Aria Operations for Logs 8.18 documentation landing page</w:t>
-        </w:r>
-      </w:hyperlink>
-    </w:p>
-    <w:p>
-      <w:pPr>
-        <w:pStyle w:val="ListParagraph"/>
-        <w:numPr>
-          <w:ilvl w:val="0"/>
-          <w:numId w:val="3"/>
-        </w:numPr>
-        <w:spacing w:after="80"/>
-      </w:pPr>
-      <w:hyperlink w:history="1" r:id="rIdwlwdcxqqxxwkgcxtx9wac">
-        <w:r>
-          <w:rPr>
-            <w:rStyle w:val="Hyperlink"/>
-            <w:color w:val="0563C1"/>
-            <w:u w:val="single"/>
-          </w:rPr>
-          <w:t xml:space="preserve">Aria Operations for Logs 8.18 Release Notes</w:t>
-        </w:r>
-      </w:hyperlink>
-    </w:p>
-    <w:p>
-      <w:pPr>
-        <w:pStyle w:val="ListParagraph"/>
-        <w:numPr>
-          <w:ilvl w:val="0"/>
-          <w:numId w:val="3"/>
-        </w:numPr>
-        <w:spacing w:after="80"/>
-      </w:pPr>
-      <w:hyperlink w:history="1" r:id="rIdboorxsv0w0pxpcuhlz6i7">
-        <w:r>
-          <w:rPr>
-            <w:rStyle w:val="Hyperlink"/>
-            <w:color w:val="0563C1"/>
-            <w:u w:val="single"/>
-          </w:rPr>
-          <w:t xml:space="preserve">Configuration Limits (8.18)</w:t>
-        </w:r>
-      </w:hyperlink>
-    </w:p>
-    <w:p>
-      <w:pPr>
-        <w:pStyle w:val="ListParagraph"/>
-        <w:numPr>
-          <w:ilvl w:val="0"/>
-          <w:numId w:val="3"/>
-        </w:numPr>
-        <w:spacing w:after="80"/>
-      </w:pPr>
-      <w:hyperlink w:history="1" r:id="rIdcrltitrrzfwobsdrw7-2v">
-        <w:r>
-          <w:rPr>
-            <w:rStyle w:val="Hyperlink"/>
-            <w:color w:val="0563C1"/>
-            <w:u w:val="single"/>
-          </w:rPr>
-          <w:t xml:space="preserve">Sizing the Aria Ops for Logs Virtual Appliance (8.18)</w:t>
-        </w:r>
-      </w:hyperlink>
-    </w:p>
-    <w:p>
-      <w:pPr>
-        <w:pStyle w:val="ListParagraph"/>
-        <w:numPr>
-          <w:ilvl w:val="0"/>
-          <w:numId w:val="3"/>
-        </w:numPr>
-        <w:spacing w:after="80"/>
-      </w:pPr>
-      <w:hyperlink w:history="1" r:id="rIdletfuqabhsmnkbbaxcab9">
-        <w:r>
-          <w:rPr>
-            <w:rStyle w:val="Hyperlink"/>
-            <w:color w:val="0563C1"/>
-            <w:u w:val="single"/>
-          </w:rPr>
-          <w:t xml:space="preserve">Using Static IP Addresses and FQDN (8.18)</w:t>
-        </w:r>
-      </w:hyperlink>
-    </w:p>
-    <w:p>
-      <w:pPr>
-        <w:pStyle w:val="ListParagraph"/>
-        <w:numPr>
-          <w:ilvl w:val="0"/>
-          <w:numId w:val="3"/>
-        </w:numPr>
-        <w:spacing w:after="80"/>
-      </w:pPr>
-      <w:hyperlink w:history="1" r:id="rIdxvgtojwgazej2dz8hwowb">
-        <w:r>
-          <w:rPr>
-            <w:rStyle w:val="Hyperlink"/>
-            <w:color w:val="0563C1"/>
-            <w:u w:val="single"/>
-          </w:rPr>
-          <w:t xml:space="preserve">Working with an Integrated Load Balancer (8.18)</w:t>
-        </w:r>
-      </w:hyperlink>
-    </w:p>
-    <w:p>
-      <w:pPr>
-        <w:pStyle w:val="ListParagraph"/>
-        <w:numPr>
-          <w:ilvl w:val="0"/>
-          <w:numId w:val="3"/>
-        </w:numPr>
-        <w:spacing w:after="80"/>
-      </w:pPr>
-      <w:hyperlink w:history="1" r:id="rIdvzxewjq2xtboc9c3mrkhk">
-        <w:r>
-          <w:rPr>
-            <w:rStyle w:val="Hyperlink"/>
-            <w:color w:val="0563C1"/>
-            <w:u w:val="single"/>
-          </w:rPr>
-          <w:t xml:space="preserve">Activate the Integrated Load Balancer</w:t>
-        </w:r>
-      </w:hyperlink>
-    </w:p>
-    <w:p>
-      <w:pPr>
-        <w:pStyle w:val="ListParagraph"/>
-        <w:numPr>
-          <w:ilvl w:val="0"/>
-          <w:numId w:val="3"/>
-        </w:numPr>
-        <w:spacing w:after="80"/>
-      </w:pPr>
-      <w:hyperlink w:history="1" r:id="rIddrbwkdooqp_ii7ltrcf89">
-        <w:r>
-          <w:rPr>
-            <w:rStyle w:val="Hyperlink"/>
-            <w:color w:val="0563C1"/>
-            <w:u w:val="single"/>
-          </w:rPr>
-          <w:t xml:space="preserve">Configure an Index Partition (8.18)</w:t>
-        </w:r>
-      </w:hyperlink>
-    </w:p>
-    <w:p>
-      <w:pPr>
-        <w:pStyle w:val="ListParagraph"/>
-        <w:numPr>
-          <w:ilvl w:val="0"/>
-          <w:numId w:val="3"/>
-        </w:numPr>
-        <w:spacing w:after="80"/>
-      </w:pPr>
-      <w:hyperlink w:history="1" r:id="rIdtitgav6fkh8mxbneom2r3">
-        <w:r>
-          <w:rPr>
-            <w:rStyle w:val="Hyperlink"/>
-            <w:color w:val="0563C1"/>
-            <w:u w:val="single"/>
-          </w:rPr>
-          <w:t xml:space="preserve">Increase the Storage Capacity of the vApp</w:t>
-        </w:r>
-      </w:hyperlink>
-    </w:p>
-    <w:p>
-      <w:pPr>
-        <w:pStyle w:val="ListParagraph"/>
-        <w:numPr>
-          <w:ilvl w:val="0"/>
-          <w:numId w:val="3"/>
-        </w:numPr>
-        <w:spacing w:after="80"/>
-      </w:pPr>
-      <w:hyperlink w:history="1" r:id="rIdpzmyzm5vas_ik4jnw2kx8">
-        <w:r>
-          <w:rPr>
-            <w:rStyle w:val="Hyperlink"/>
-            <w:color w:val="0563C1"/>
-            <w:u w:val="single"/>
-          </w:rPr>
-          <w:t xml:space="preserve">Aria Operations for Logs 8.18 Administering Guide (PDF)</w:t>
-        </w:r>
-      </w:hyperlink>
+        <w:t xml:space="preserve">Short answer</w:t>
+      </w:r>
+    </w:p>
+    <w:p>
+      <w:pPr>
+        <w:spacing w:after="120"/>
+      </w:pPr>
+      <w:r>
+        <w:t xml:space="preserve">Aria Operations for Logs 8.18 does not have a native "allow-list of source IPs" at the syslog/CFAPI listener level — the listener accepts traffic from anything that can reach it on the network. The supported, appliance-side ways to stop unwanted log data are: (1) drop logs at ingest using a Log Filter Configuration, (2) restrict reachability with a network firewall in front of the appliance, and (3) clean up the host inventory after the fact. Each is covered below with the official Broadcom references.</w:t>
+      </w:r>
+    </w:p>
+    <w:p>
+      <w:pPr>
+        <w:spacing w:after="120"/>
+      </w:pPr>
+      <w:r>
+        <w:rPr>
+          <w:i/>
+          <w:iCs/>
+        </w:rPr>
+        <w:t xml:space="preserve">Important conceptual point: Aria Operations for Logs charges its capacity (EPS, storage, query load) against logs that are ingested. A Log Filter Configuration that drops at ingest does NOT save the network bandwidth of the inbound traffic, but it DOES save indexing, storage, and search overhead. To stop the traffic from arriving at all, you must use network/firewall controls.</w:t>
+      </w:r>
     </w:p>
     <w:p>
       <w:pPr>
@@ -1411,6 +1231,891 @@
         <w:spacing w:after="120" w:before="220"/>
       </w:pPr>
       <w:r>
+        <w:t xml:space="preserve">Option A — Log Filter Configuration (drop at ingest, on the appliance)</w:t>
+      </w:r>
+    </w:p>
+    <w:p>
+      <w:pPr>
+        <w:spacing w:after="120"/>
+      </w:pPr>
+      <w:r>
+        <w:t xml:space="preserve">This is the primary Broadcom-supported, appliance-side mechanism. A log filter configuration drops matching logs before they are written to the index, so they do not consume storage and do not appear in queries. It is configured entirely in the Aria Operations for Logs UI.</w:t>
+      </w:r>
+    </w:p>
+    <w:p>
+      <w:pPr>
+        <w:pStyle w:val="ListParagraph"/>
+        <w:numPr>
+          <w:ilvl w:val="0"/>
+          <w:numId w:val="2"/>
+        </w:numPr>
+        <w:spacing w:after="80"/>
+      </w:pPr>
+      <w:r>
+        <w:t xml:space="preserve">Log in to the Aria Operations for Logs UI as a Super Admin (or a role with the equivalent permission).</w:t>
+      </w:r>
+    </w:p>
+    <w:p>
+      <w:pPr>
+        <w:pStyle w:val="ListParagraph"/>
+        <w:numPr>
+          <w:ilvl w:val="0"/>
+          <w:numId w:val="2"/>
+        </w:numPr>
+        <w:spacing w:after="80"/>
+      </w:pPr>
+      <w:r>
+        <w:t xml:space="preserve">Navigate to Log Management → Log Filtering, then click New Configuration.</w:t>
+      </w:r>
+    </w:p>
+    <w:p>
+      <w:pPr>
+        <w:pStyle w:val="ListParagraph"/>
+        <w:numPr>
+          <w:ilvl w:val="0"/>
+          <w:numId w:val="2"/>
+        </w:numPr>
+        <w:spacing w:after="80"/>
+      </w:pPr>
+      <w:r>
+        <w:t xml:space="preserve">Give the filter a unique name (e.g., "Drop_Decommissioned_Subnet" or "Drop_OldDomain_Hosts").</w:t>
+      </w:r>
+    </w:p>
+    <w:p>
+      <w:pPr>
+        <w:pStyle w:val="ListParagraph"/>
+        <w:numPr>
+          <w:ilvl w:val="0"/>
+          <w:numId w:val="2"/>
+        </w:numPr>
+        <w:spacing w:after="80"/>
+      </w:pPr>
+      <w:r>
+        <w:t xml:space="preserve">Define filter criteria using static fields. The most useful fields for "block by source" use cases are hostname (the source hostname/FQDN as parsed from the syslog message) and source (the source IP). You can also key off appname, vc_event_type, or any other static extracted field. Operators include contains, doesnotContain, startsWith, doesNotStartWith, matchesRegex, exists, doesNotExist.</w:t>
+      </w:r>
+    </w:p>
+    <w:p>
+      <w:pPr>
+        <w:pStyle w:val="ListParagraph"/>
+        <w:numPr>
+          <w:ilvl w:val="0"/>
+          <w:numId w:val="2"/>
+        </w:numPr>
+        <w:spacing w:after="80"/>
+      </w:pPr>
+      <w:r>
+        <w:t xml:space="preserve">Click Run in Explore Logs first to preview which logs the filter would drop. Adjust until the preview matches only the logs you want to discard.</w:t>
+      </w:r>
+    </w:p>
+    <w:p>
+      <w:pPr>
+        <w:pStyle w:val="ListParagraph"/>
+        <w:numPr>
+          <w:ilvl w:val="0"/>
+          <w:numId w:val="2"/>
+        </w:numPr>
+        <w:spacing w:after="80"/>
+      </w:pPr>
+      <w:r>
+        <w:t xml:space="preserve">Save and toggle the configuration to Activated. Per Broadcom, "the logs matching the filter criteria are no longer ingested into the current Aria Operations for Logs instance." The filter only applies to NEW logs ingested after the rule is enabled — historical logs remain.</w:t>
+      </w:r>
+    </w:p>
+    <w:p>
+      <w:pPr>
+        <w:spacing w:after="160"/>
+      </w:pPr>
+      <w:r>
+        <w:t xml:space="preserve">Reference: </w:t>
+      </w:r>
+      <w:hyperlink w:history="1" r:id="rIdyjnli9tch4gclfrf-9gsv">
+        <w:r>
+          <w:rPr>
+            <w:rStyle w:val="Hyperlink"/>
+            <w:color w:val="0563C1"/>
+            <w:u w:val="single"/>
+          </w:rPr>
+          <w:t xml:space="preserve">Add a Log Filter Configuration (8.18)</w:t>
+        </w:r>
+      </w:hyperlink>
+      <w:r>
+        <w:t xml:space="preserve"> (8.16 page; the same UI and behavior apply in 8.18 — see the 8.18 PDF, "Add a Log Filter Configuration" on p. 221: </w:t>
+      </w:r>
+      <w:hyperlink w:history="1" r:id="rIdwiojuazotm-hyygbgzeio">
+        <w:r>
+          <w:rPr>
+            <w:rStyle w:val="Hyperlink"/>
+            <w:color w:val="0563C1"/>
+            <w:u w:val="single"/>
+          </w:rPr>
+          <w:t xml:space="preserve">Aria Operations for Logs 8.18 Administering Guide (PDF)</w:t>
+        </w:r>
+      </w:hyperlink>
+      <w:r>
+        <w:t xml:space="preserve">).</w:t>
+      </w:r>
+    </w:p>
+    <w:p>
+      <w:pPr>
+        <w:pStyle w:val="Heading3"/>
+        <w:spacing w:after="100" w:before="180"/>
+      </w:pPr>
+      <w:r>
+        <w:t xml:space="preserve">Caveats and gotchas for Log Filter Configurations</w:t>
+      </w:r>
+    </w:p>
+    <w:p>
+      <w:pPr>
+        <w:pStyle w:val="ListParagraph"/>
+        <w:numPr>
+          <w:ilvl w:val="0"/>
+          <w:numId w:val="3"/>
+        </w:numPr>
+        <w:spacing w:after="80"/>
+      </w:pPr>
+      <w:r>
+        <w:t xml:space="preserve">Filters apply only to logs with static fields in the filter criteria. Dynamic/runtime-extracted fields will not match. Test with the Explore Logs preview first.</w:t>
+      </w:r>
+    </w:p>
+    <w:p>
+      <w:pPr>
+        <w:pStyle w:val="ListParagraph"/>
+        <w:numPr>
+          <w:ilvl w:val="0"/>
+          <w:numId w:val="3"/>
+        </w:numPr>
+        <w:spacing w:after="80"/>
+      </w:pPr>
+      <w:r>
+        <w:t xml:space="preserve">Filters are forward-only. Existing already-indexed logs are NOT removed when you create a filter — only new ingest after activation is dropped.</w:t>
+      </w:r>
+    </w:p>
+    <w:p>
+      <w:pPr>
+        <w:pStyle w:val="ListParagraph"/>
+        <w:numPr>
+          <w:ilvl w:val="0"/>
+          <w:numId w:val="3"/>
+        </w:numPr>
+        <w:spacing w:after="80"/>
+      </w:pPr>
+      <w:r>
+        <w:rPr>
+          <w:b/>
+          <w:bCs/>
+        </w:rPr>
+        <w:t xml:space="preserve">Filters do NOT save inbound network bandwidth or syslog connection slots. The appliance still accepts the TCP/UDP connection, parses the message, and then discards it. If you need to preserve bandwidth or syslog connection counts (max 750 per node), use Option B (network firewall) instead.</w:t>
+      </w:r>
+    </w:p>
+    <w:p>
+      <w:pPr>
+        <w:pStyle w:val="ListParagraph"/>
+        <w:numPr>
+          <w:ilvl w:val="0"/>
+          <w:numId w:val="3"/>
+        </w:numPr>
+        <w:spacing w:after="80"/>
+      </w:pPr>
+      <w:r>
+        <w:t xml:space="preserve">A known 8.18 issue: when many filters are configured in agent groups, the configuration save can fail. The release notes document a workaround. Reference: </w:t>
+      </w:r>
+      <w:hyperlink w:history="1" r:id="rId7shuatqcoqokrzh_w7xgf">
+        <w:r>
+          <w:rPr>
+            <w:rStyle w:val="Hyperlink"/>
+            <w:color w:val="0563C1"/>
+            <w:u w:val="single"/>
+          </w:rPr>
+          <w:t xml:space="preserve">Aria Operations for Logs 8.18 Release Notes</w:t>
+        </w:r>
+      </w:hyperlink>
+    </w:p>
+    <w:p>
+      <w:pPr>
+        <w:pStyle w:val="Heading2"/>
+        <w:spacing w:after="120" w:before="220"/>
+      </w:pPr>
+      <w:r>
+        <w:t xml:space="preserve">Option B — Network/firewall in front of the appliance (the only true "block")</w:t>
+      </w:r>
+    </w:p>
+    <w:p>
+      <w:pPr>
+        <w:spacing w:after="120"/>
+      </w:pPr>
+      <w:r>
+        <w:t xml:space="preserve">Because Aria Operations for Logs has no native source-IP allow-list on its syslog/CFAPI listeners, the only way to actually prevent unwanted source traffic from reaching the appliance is to enforce that at the network layer. Broadcom explicitly recommends this design.</w:t>
+      </w:r>
+    </w:p>
+    <w:p>
+      <w:pPr>
+        <w:spacing w:after="120"/>
+      </w:pPr>
+      <w:r>
+        <w:t xml:space="preserve">From the official 8.18 Security Considerations: "To protect sensitive information gathered by VMware Aria Operations for Logs, place the server or servers on a management network segment protected by a firewall from the rest of your internal network."</w:t>
+      </w:r>
+    </w:p>
+    <w:p>
+      <w:pPr>
+        <w:spacing w:after="160"/>
+      </w:pPr>
+      <w:r>
+        <w:t xml:space="preserve">Reference: </w:t>
+      </w:r>
+      <w:hyperlink w:history="1" r:id="rIdqwhv7_la5roo5iq2_n8e-">
+        <w:r>
+          <w:rPr>
+            <w:rStyle w:val="Hyperlink"/>
+            <w:color w:val="0563C1"/>
+            <w:u w:val="single"/>
+          </w:rPr>
+          <w:t xml:space="preserve">Aria Operations for Logs Firewall Recommendations (8.18)</w:t>
+        </w:r>
+      </w:hyperlink>
+      <w:r>
+        <w:t xml:space="preserve"> and </w:t>
+      </w:r>
+      <w:hyperlink w:history="1" r:id="rId91psw0qoco7yn_gn6mv8x">
+        <w:r>
+          <w:rPr>
+            <w:rStyle w:val="Hyperlink"/>
+            <w:color w:val="0563C1"/>
+            <w:u w:val="single"/>
+          </w:rPr>
+          <w:t xml:space="preserve">Ports and External Interfaces (8.18)</w:t>
+        </w:r>
+      </w:hyperlink>
+    </w:p>
+    <w:p>
+      <w:pPr>
+        <w:pStyle w:val="Heading3"/>
+        <w:spacing w:after="100" w:before="180"/>
+      </w:pPr>
+      <w:r>
+        <w:t xml:space="preserve">Recommended approach</w:t>
+      </w:r>
+    </w:p>
+    <w:p>
+      <w:pPr>
+        <w:pStyle w:val="ListParagraph"/>
+        <w:numPr>
+          <w:ilvl w:val="0"/>
+          <w:numId w:val="3"/>
+        </w:numPr>
+        <w:spacing w:after="80"/>
+      </w:pPr>
+      <w:r>
+        <w:t xml:space="preserve">Place the cluster (and the ILB VIP) on a dedicated management network segment. Use an external firewall (perimeter, NSX DFW with the IMPORTANT exception below, or upstream router ACLs) to permit inbound syslog (514/TCP/UDP, 1514/TCP, 6514/TCP) and CFAPI (9000/TCP, 9543/TCP) ONLY from the source IP ranges/subnets you trust.</w:t>
+      </w:r>
+    </w:p>
+    <w:p>
+      <w:pPr>
+        <w:pStyle w:val="ListParagraph"/>
+        <w:numPr>
+          <w:ilvl w:val="0"/>
+          <w:numId w:val="3"/>
+        </w:numPr>
+        <w:spacing w:after="80"/>
+      </w:pPr>
+      <w:r>
+        <w:t xml:space="preserve">Default-deny everything else. New unwanted sources cannot reach the listener at all, so they consume no EPS, no storage, and no syslog connection slots.</w:t>
+      </w:r>
+    </w:p>
+    <w:p>
+      <w:pPr>
+        <w:pStyle w:val="ListParagraph"/>
+        <w:numPr>
+          <w:ilvl w:val="0"/>
+          <w:numId w:val="3"/>
+        </w:numPr>
+        <w:spacing w:after="80"/>
+      </w:pPr>
+      <w:r>
+        <w:t xml:space="preserve">IMPORTANT — NSX Distributed Firewall caveat: If you use NSX, you cannot apply the NSX DFW directly to the Aria Operations for Logs cluster nodes when the ILB is enabled. The ILB uses Linux Virtual Server in Direct Server Return (LVS-DR), which NSX does not support. The supported approach is to add the Aria Operations for Logs nodes to the NSX DFW exclusion list and reboot every node. Reference: </w:t>
+      </w:r>
+      <w:hyperlink w:history="1" r:id="rIdnxyexowmefbr_akyh68kj">
+        <w:r>
+          <w:rPr>
+            <w:rStyle w:val="Hyperlink"/>
+            <w:color w:val="0563C1"/>
+            <w:u w:val="single"/>
+          </w:rPr>
+          <w:t xml:space="preserve">KB 315975 — Aria Operations for Logs load balancer incompatible with NSX DFW Protection</w:t>
+        </w:r>
+      </w:hyperlink>
+    </w:p>
+    <w:p>
+      <w:pPr>
+        <w:pStyle w:val="ListParagraph"/>
+        <w:numPr>
+          <w:ilvl w:val="0"/>
+          <w:numId w:val="3"/>
+        </w:numPr>
+        <w:spacing w:after="80"/>
+      </w:pPr>
+      <w:r>
+        <w:t xml:space="preserve">For NSX environments, enforce source filtering at a different policy point: the perimeter firewall, an upstream router/L3 ACL, or an NSX gateway firewall (Tier-0/Tier-1) — anywhere except the DFW directly on the appliance VMs.</w:t>
+      </w:r>
+    </w:p>
+    <w:p>
+      <w:pPr>
+        <w:pStyle w:val="ListParagraph"/>
+        <w:numPr>
+          <w:ilvl w:val="0"/>
+          <w:numId w:val="3"/>
+        </w:numPr>
+        <w:spacing w:after="80"/>
+      </w:pPr>
+      <w:r>
+        <w:rPr>
+          <w:b/>
+          <w:bCs/>
+        </w:rPr>
+        <w:t xml:space="preserve">Customizing iptables on the SUSE-based appliance OS itself is not a Broadcom-supported configuration and is overwritten by upgrades. Do source-IP filtering upstream of the VM, not on the appliance.</w:t>
+      </w:r>
+    </w:p>
+    <w:p>
+      <w:pPr>
+        <w:pStyle w:val="Heading2"/>
+        <w:spacing w:after="120" w:before="220"/>
+      </w:pPr>
+      <w:r>
+        <w:t xml:space="preserve">Option C — Combine A + B (recommended for this migration)</w:t>
+      </w:r>
+    </w:p>
+    <w:p>
+      <w:pPr>
+        <w:spacing w:after="120"/>
+      </w:pPr>
+      <w:r>
+        <w:t xml:space="preserve">For the customer's domain-migration project, the cleanest pattern is:</w:t>
+      </w:r>
+    </w:p>
+    <w:p>
+      <w:pPr>
+        <w:pStyle w:val="ListParagraph"/>
+        <w:numPr>
+          <w:ilvl w:val="0"/>
+          <w:numId w:val="2"/>
+        </w:numPr>
+        <w:spacing w:after="80"/>
+      </w:pPr>
+      <w:r>
+        <w:t xml:space="preserve">Use the upstream firewall (Option B) to permit inbound log traffic only from the IP subnets that contain known, sanctioned sources. This is the hard perimeter — it stops rogue/decommissioned/unknown systems from reaching the listener at all.</w:t>
+      </w:r>
+    </w:p>
+    <w:p>
+      <w:pPr>
+        <w:pStyle w:val="ListParagraph"/>
+        <w:numPr>
+          <w:ilvl w:val="0"/>
+          <w:numId w:val="2"/>
+        </w:numPr>
+        <w:spacing w:after="80"/>
+      </w:pPr>
+      <w:r>
+        <w:t xml:space="preserve">Use Log Filter Configurations (Option A) for fine-grained drops within sanctioned subnets — for example, dropping noisy app names from specific hosts, dropping logs from old-domain hostnames after migration, or dropping known-noisy facilities/severities (e.g., debug-level entries from a specific subsystem).</w:t>
+      </w:r>
+    </w:p>
+    <w:p>
+      <w:pPr>
+        <w:pStyle w:val="ListParagraph"/>
+        <w:numPr>
+          <w:ilvl w:val="0"/>
+          <w:numId w:val="2"/>
+        </w:numPr>
+        <w:spacing w:after="80"/>
+      </w:pPr>
+      <w:r>
+        <w:t xml:space="preserve">Use Index Partitions (covered earlier in this document) to apply different retention to different categories of logs you DO want to keep. Reference: </w:t>
+      </w:r>
+      <w:hyperlink w:history="1" r:id="rId08titonh9fmz-vwwjojs6">
+        <w:r>
+          <w:rPr>
+            <w:rStyle w:val="Hyperlink"/>
+            <w:color w:val="0563C1"/>
+            <w:u w:val="single"/>
+          </w:rPr>
+          <w:t xml:space="preserve">Configure an Index Partition (8.18)</w:t>
+        </w:r>
+      </w:hyperlink>
+    </w:p>
+    <w:p>
+      <w:pPr>
+        <w:pStyle w:val="Heading2"/>
+        <w:spacing w:after="120" w:before="220"/>
+      </w:pPr>
+      <w:r>
+        <w:t xml:space="preserve">Option D — Cleaning up the host inventory after the fact</w:t>
+      </w:r>
+    </w:p>
+    <w:p>
+      <w:pPr>
+        <w:spacing w:after="120"/>
+      </w:pPr>
+      <w:r>
+        <w:t xml:space="preserve">Even after you stop ingesting from a source, that source's hostname will continue to appear in the Management → Hosts page until it ages out. Broadcom's default behavior is that inactive hosts are automatically purged about 90–93 days after the last ingested event.</w:t>
+      </w:r>
+    </w:p>
+    <w:p>
+      <w:pPr>
+        <w:spacing w:after="120"/>
+      </w:pPr>
+      <w:r>
+        <w:t xml:space="preserve">If you need to remove inactive/duplicate host entries immediately (for example, after the domain rename creates duplicate entries — old FQDN and new FQDN for the same physical device), Broadcom provides a supported procedure to truncate the ingestion_hosts_v3 table in Cassandra on the primary node. This requires a snapshot first and should be done with care.</w:t>
+      </w:r>
+    </w:p>
+    <w:p>
+      <w:pPr>
+        <w:spacing w:after="160"/>
+      </w:pPr>
+      <w:r>
+        <w:t xml:space="preserve">References: </w:t>
+      </w:r>
+      <w:hyperlink w:history="1" r:id="rIdfbqzmty0oaklxnvxa1q3m">
+        <w:r>
+          <w:rPr>
+            <w:rStyle w:val="Hyperlink"/>
+            <w:color w:val="0563C1"/>
+            <w:u w:val="single"/>
+          </w:rPr>
+          <w:t xml:space="preserve">KB — Receiving multiple inactive host alerts (truncate ingestion_hosts_v3)</w:t>
+        </w:r>
+      </w:hyperlink>
+      <w:r>
+        <w:t xml:space="preserve"> and </w:t>
+      </w:r>
+      <w:hyperlink w:history="1" r:id="rIdfbi7hrfxouq_yxedlcnvf">
+        <w:r>
+          <w:rPr>
+            <w:rStyle w:val="Hyperlink"/>
+            <w:color w:val="0563C1"/>
+            <w:u w:val="single"/>
+          </w:rPr>
+          <w:t xml:space="preserve">KB — Multiple Inactive ESXi Host Email Alerts</w:t>
+        </w:r>
+      </w:hyperlink>
+    </w:p>
+    <w:p>
+      <w:pPr>
+        <w:pStyle w:val="Heading2"/>
+        <w:spacing w:after="120" w:before="220"/>
+      </w:pPr>
+      <w:r>
+        <w:t xml:space="preserve">What is NOT a supported appliance-side option</w:t>
+      </w:r>
+    </w:p>
+    <w:p>
+      <w:pPr>
+        <w:pStyle w:val="ListParagraph"/>
+        <w:numPr>
+          <w:ilvl w:val="0"/>
+          <w:numId w:val="3"/>
+        </w:numPr>
+        <w:spacing w:after="80"/>
+      </w:pPr>
+      <w:r>
+        <w:t xml:space="preserve">There is no per-source-IP allow-list or deny-list inside the Aria Operations for Logs UI. The Log Filter Configuration is field-based (hostname, source, appname, etc.), not socket-based.</w:t>
+      </w:r>
+    </w:p>
+    <w:p>
+      <w:pPr>
+        <w:pStyle w:val="ListParagraph"/>
+        <w:numPr>
+          <w:ilvl w:val="0"/>
+          <w:numId w:val="3"/>
+        </w:numPr>
+        <w:spacing w:after="80"/>
+      </w:pPr>
+      <w:r>
+        <w:t xml:space="preserve">There is no built-in rate limit per source on the appliance. If a single rogue source floods syslog, the appliance will accept until it hits per-node EPS or syslog-connection limits — that is again a network/firewall problem to solve upstream.</w:t>
+      </w:r>
+    </w:p>
+    <w:p>
+      <w:pPr>
+        <w:pStyle w:val="ListParagraph"/>
+        <w:numPr>
+          <w:ilvl w:val="0"/>
+          <w:numId w:val="3"/>
+        </w:numPr>
+        <w:spacing w:after="80"/>
+      </w:pPr>
+      <w:r>
+        <w:t xml:space="preserve">Modifying the appliance OS firewall (iptables/firewalld) directly is not Broadcom-supported and changes do not survive upgrades.</w:t>
+      </w:r>
+    </w:p>
+    <w:p>
+      <w:pPr>
+        <w:pStyle w:val="Heading2"/>
+        <w:spacing w:after="120" w:before="220"/>
+      </w:pPr>
+      <w:r>
+        <w:t xml:space="preserve">Quick decision guide</w:t>
+      </w:r>
+    </w:p>
+    <w:p>
+      <w:pPr>
+        <w:pStyle w:val="ListParagraph"/>
+        <w:numPr>
+          <w:ilvl w:val="0"/>
+          <w:numId w:val="3"/>
+        </w:numPr>
+        <w:spacing w:after="80"/>
+      </w:pPr>
+      <w:r>
+        <w:rPr>
+          <w:b/>
+          <w:bCs/>
+        </w:rPr>
+        <w:t xml:space="preserve">Want to stop unknown/rogue sources from reaching the appliance at all → </w:t>
+      </w:r>
+      <w:r>
+        <w:t xml:space="preserve">Network firewall (Option B). This is the only way to truly block.</w:t>
+      </w:r>
+    </w:p>
+    <w:p>
+      <w:pPr>
+        <w:pStyle w:val="ListParagraph"/>
+        <w:numPr>
+          <w:ilvl w:val="0"/>
+          <w:numId w:val="3"/>
+        </w:numPr>
+        <w:spacing w:after="80"/>
+      </w:pPr>
+      <w:r>
+        <w:rPr>
+          <w:b/>
+          <w:bCs/>
+        </w:rPr>
+        <w:t xml:space="preserve">Want to keep accepting traffic but stop indexing/storing certain noisy logs → </w:t>
+      </w:r>
+      <w:r>
+        <w:t xml:space="preserve">Log Filter Configuration in the UI (Option A).</w:t>
+      </w:r>
+    </w:p>
+    <w:p>
+      <w:pPr>
+        <w:pStyle w:val="ListParagraph"/>
+        <w:numPr>
+          <w:ilvl w:val="0"/>
+          <w:numId w:val="3"/>
+        </w:numPr>
+        <w:spacing w:after="80"/>
+      </w:pPr>
+      <w:r>
+        <w:rPr>
+          <w:b/>
+          <w:bCs/>
+        </w:rPr>
+        <w:t xml:space="preserve">Want to keep traffic but route certain logs to a shorter-retention bucket → </w:t>
+      </w:r>
+      <w:r>
+        <w:t xml:space="preserve">Index Partition with a short retention period.</w:t>
+      </w:r>
+    </w:p>
+    <w:p>
+      <w:pPr>
+        <w:pStyle w:val="ListParagraph"/>
+        <w:numPr>
+          <w:ilvl w:val="0"/>
+          <w:numId w:val="3"/>
+        </w:numPr>
+        <w:spacing w:after="80"/>
+      </w:pPr>
+      <w:r>
+        <w:rPr>
+          <w:b/>
+          <w:bCs/>
+        </w:rPr>
+        <w:t xml:space="preserve">Want stale hostnames to disappear from the Hosts page → </w:t>
+      </w:r>
+      <w:r>
+        <w:t xml:space="preserve">Wait ~90 days, or use the supported Cassandra truncate procedure (Option D).</w:t>
+      </w:r>
+    </w:p>
+    <w:p>
+      <w:pPr>
+        <w:pStyle w:val="Heading1"/>
+        <w:spacing w:after="160" w:before="280"/>
+      </w:pPr>
+      <w:r>
+        <w:t xml:space="preserve">Consolidated reference list</w:t>
+      </w:r>
+    </w:p>
+    <w:p>
+      <w:pPr>
+        <w:pStyle w:val="Heading2"/>
+        <w:spacing w:after="120" w:before="220"/>
+      </w:pPr>
+      <w:r>
+        <w:t xml:space="preserve">Aria Operations for Logs 8.18 — official documentation</w:t>
+      </w:r>
+    </w:p>
+    <w:p>
+      <w:pPr>
+        <w:pStyle w:val="ListParagraph"/>
+        <w:numPr>
+          <w:ilvl w:val="0"/>
+          <w:numId w:val="3"/>
+        </w:numPr>
+        <w:spacing w:after="80"/>
+      </w:pPr>
+      <w:hyperlink w:history="1" r:id="rIdmnb8k1tpaeedqf4yb_nb2">
+        <w:r>
+          <w:rPr>
+            <w:rStyle w:val="Hyperlink"/>
+            <w:color w:val="0563C1"/>
+            <w:u w:val="single"/>
+          </w:rPr>
+          <w:t xml:space="preserve">Aria Operations for Logs 8.18 documentation landing page</w:t>
+        </w:r>
+      </w:hyperlink>
+    </w:p>
+    <w:p>
+      <w:pPr>
+        <w:pStyle w:val="ListParagraph"/>
+        <w:numPr>
+          <w:ilvl w:val="0"/>
+          <w:numId w:val="3"/>
+        </w:numPr>
+        <w:spacing w:after="80"/>
+      </w:pPr>
+      <w:hyperlink w:history="1" r:id="rIdji01d8j7xoowxrejnkvwv">
+        <w:r>
+          <w:rPr>
+            <w:rStyle w:val="Hyperlink"/>
+            <w:color w:val="0563C1"/>
+            <w:u w:val="single"/>
+          </w:rPr>
+          <w:t xml:space="preserve">Aria Operations for Logs 8.18 Release Notes</w:t>
+        </w:r>
+      </w:hyperlink>
+    </w:p>
+    <w:p>
+      <w:pPr>
+        <w:pStyle w:val="ListParagraph"/>
+        <w:numPr>
+          <w:ilvl w:val="0"/>
+          <w:numId w:val="3"/>
+        </w:numPr>
+        <w:spacing w:after="80"/>
+      </w:pPr>
+      <w:hyperlink w:history="1" r:id="rIdabcm9fvilzs59iyvgwwr-">
+        <w:r>
+          <w:rPr>
+            <w:rStyle w:val="Hyperlink"/>
+            <w:color w:val="0563C1"/>
+            <w:u w:val="single"/>
+          </w:rPr>
+          <w:t xml:space="preserve">Configuration Limits (8.18)</w:t>
+        </w:r>
+      </w:hyperlink>
+    </w:p>
+    <w:p>
+      <w:pPr>
+        <w:pStyle w:val="ListParagraph"/>
+        <w:numPr>
+          <w:ilvl w:val="0"/>
+          <w:numId w:val="3"/>
+        </w:numPr>
+        <w:spacing w:after="80"/>
+      </w:pPr>
+      <w:hyperlink w:history="1" r:id="rIdtipcayiotlkyslkypijo6">
+        <w:r>
+          <w:rPr>
+            <w:rStyle w:val="Hyperlink"/>
+            <w:color w:val="0563C1"/>
+            <w:u w:val="single"/>
+          </w:rPr>
+          <w:t xml:space="preserve">Sizing the Aria Ops for Logs Virtual Appliance (8.18)</w:t>
+        </w:r>
+      </w:hyperlink>
+    </w:p>
+    <w:p>
+      <w:pPr>
+        <w:pStyle w:val="ListParagraph"/>
+        <w:numPr>
+          <w:ilvl w:val="0"/>
+          <w:numId w:val="3"/>
+        </w:numPr>
+        <w:spacing w:after="80"/>
+      </w:pPr>
+      <w:hyperlink w:history="1" r:id="rIdmabqupubpyslqtjh0drvg">
+        <w:r>
+          <w:rPr>
+            <w:rStyle w:val="Hyperlink"/>
+            <w:color w:val="0563C1"/>
+            <w:u w:val="single"/>
+          </w:rPr>
+          <w:t xml:space="preserve">Using Static IP Addresses and FQDN (8.18)</w:t>
+        </w:r>
+      </w:hyperlink>
+    </w:p>
+    <w:p>
+      <w:pPr>
+        <w:pStyle w:val="ListParagraph"/>
+        <w:numPr>
+          <w:ilvl w:val="0"/>
+          <w:numId w:val="3"/>
+        </w:numPr>
+        <w:spacing w:after="80"/>
+      </w:pPr>
+      <w:hyperlink w:history="1" r:id="rIdxrafvgvceaz7nmdf_0apz">
+        <w:r>
+          <w:rPr>
+            <w:rStyle w:val="Hyperlink"/>
+            <w:color w:val="0563C1"/>
+            <w:u w:val="single"/>
+          </w:rPr>
+          <w:t xml:space="preserve">Working with an Integrated Load Balancer (8.18)</w:t>
+        </w:r>
+      </w:hyperlink>
+    </w:p>
+    <w:p>
+      <w:pPr>
+        <w:pStyle w:val="ListParagraph"/>
+        <w:numPr>
+          <w:ilvl w:val="0"/>
+          <w:numId w:val="3"/>
+        </w:numPr>
+        <w:spacing w:after="80"/>
+      </w:pPr>
+      <w:hyperlink w:history="1" r:id="rIdtqkynk-cvqxdprvoj20j5">
+        <w:r>
+          <w:rPr>
+            <w:rStyle w:val="Hyperlink"/>
+            <w:color w:val="0563C1"/>
+            <w:u w:val="single"/>
+          </w:rPr>
+          <w:t xml:space="preserve">Activate the Integrated Load Balancer</w:t>
+        </w:r>
+      </w:hyperlink>
+    </w:p>
+    <w:p>
+      <w:pPr>
+        <w:pStyle w:val="ListParagraph"/>
+        <w:numPr>
+          <w:ilvl w:val="0"/>
+          <w:numId w:val="3"/>
+        </w:numPr>
+        <w:spacing w:after="80"/>
+      </w:pPr>
+      <w:hyperlink w:history="1" r:id="rIdouwte6ciazbh2jpn0kh_2">
+        <w:r>
+          <w:rPr>
+            <w:rStyle w:val="Hyperlink"/>
+            <w:color w:val="0563C1"/>
+            <w:u w:val="single"/>
+          </w:rPr>
+          <w:t xml:space="preserve">Configure an Index Partition (8.18)</w:t>
+        </w:r>
+      </w:hyperlink>
+    </w:p>
+    <w:p>
+      <w:pPr>
+        <w:pStyle w:val="ListParagraph"/>
+        <w:numPr>
+          <w:ilvl w:val="0"/>
+          <w:numId w:val="3"/>
+        </w:numPr>
+        <w:spacing w:after="80"/>
+      </w:pPr>
+      <w:hyperlink w:history="1" r:id="rIdhsueg9gs7tlea1f4x7nls">
+        <w:r>
+          <w:rPr>
+            <w:rStyle w:val="Hyperlink"/>
+            <w:color w:val="0563C1"/>
+            <w:u w:val="single"/>
+          </w:rPr>
+          <w:t xml:space="preserve">Increase the Storage Capacity of the vApp</w:t>
+        </w:r>
+      </w:hyperlink>
+    </w:p>
+    <w:p>
+      <w:pPr>
+        <w:pStyle w:val="ListParagraph"/>
+        <w:numPr>
+          <w:ilvl w:val="0"/>
+          <w:numId w:val="3"/>
+        </w:numPr>
+        <w:spacing w:after="80"/>
+      </w:pPr>
+      <w:hyperlink w:history="1" r:id="rIdd6c89riamjcbxff3lgx6_">
+        <w:r>
+          <w:rPr>
+            <w:rStyle w:val="Hyperlink"/>
+            <w:color w:val="0563C1"/>
+            <w:u w:val="single"/>
+          </w:rPr>
+          <w:t xml:space="preserve">Aria Operations for Logs 8.18 Administering Guide (PDF)</w:t>
+        </w:r>
+      </w:hyperlink>
+    </w:p>
+    <w:p>
+      <w:pPr>
+        <w:pStyle w:val="ListParagraph"/>
+        <w:numPr>
+          <w:ilvl w:val="0"/>
+          <w:numId w:val="3"/>
+        </w:numPr>
+        <w:spacing w:after="80"/>
+      </w:pPr>
+      <w:hyperlink w:history="1" r:id="rIdvbhbnhrmenruxe7ir6ljl">
+        <w:r>
+          <w:rPr>
+            <w:rStyle w:val="Hyperlink"/>
+            <w:color w:val="0563C1"/>
+            <w:u w:val="single"/>
+          </w:rPr>
+          <w:t xml:space="preserve">Add a Log Filter Configuration</w:t>
+        </w:r>
+      </w:hyperlink>
+    </w:p>
+    <w:p>
+      <w:pPr>
+        <w:pStyle w:val="ListParagraph"/>
+        <w:numPr>
+          <w:ilvl w:val="0"/>
+          <w:numId w:val="3"/>
+        </w:numPr>
+        <w:spacing w:after="80"/>
+      </w:pPr>
+      <w:hyperlink w:history="1" r:id="rIdehx-krnitfbh4dv3rfmea">
+        <w:r>
+          <w:rPr>
+            <w:rStyle w:val="Hyperlink"/>
+            <w:color w:val="0563C1"/>
+            <w:u w:val="single"/>
+          </w:rPr>
+          <w:t xml:space="preserve">Aria Operations for Logs Firewall Recommendations / Security Considerations (8.18)</w:t>
+        </w:r>
+      </w:hyperlink>
+    </w:p>
+    <w:p>
+      <w:pPr>
+        <w:pStyle w:val="ListParagraph"/>
+        <w:numPr>
+          <w:ilvl w:val="0"/>
+          <w:numId w:val="3"/>
+        </w:numPr>
+        <w:spacing w:after="80"/>
+      </w:pPr>
+      <w:hyperlink w:history="1" r:id="rIdtstq9hevjkud9_7mde-zg">
+        <w:r>
+          <w:rPr>
+            <w:rStyle w:val="Hyperlink"/>
+            <w:color w:val="0563C1"/>
+            <w:u w:val="single"/>
+          </w:rPr>
+          <w:t xml:space="preserve">Ports and External Interfaces (8.18)</w:t>
+        </w:r>
+      </w:hyperlink>
+    </w:p>
+    <w:p>
+      <w:pPr>
+        <w:pStyle w:val="Heading2"/>
+        <w:spacing w:after="120" w:before="220"/>
+      </w:pPr>
+      <w:r>
         <w:t xml:space="preserve">Broadcom Knowledge Base articles</w:t>
       </w:r>
     </w:p>
@@ -1423,7 +2128,7 @@
         </w:numPr>
         <w:spacing w:after="80"/>
       </w:pPr>
-      <w:hyperlink w:history="1" r:id="rIduls0eyqrnj02stnyydxpo">
+      <w:hyperlink w:history="1" r:id="rIdeobdhu8gfdbjrsg3vbjtz">
         <w:r>
           <w:rPr>
             <w:rStyle w:val="Hyperlink"/>
@@ -1443,7 +2148,7 @@
         </w:numPr>
         <w:spacing w:after="80"/>
       </w:pPr>
-      <w:hyperlink w:history="1" r:id="rIdxpcmtm6skuslxhwiril5t">
+      <w:hyperlink w:history="1" r:id="rId9v7aje0src6r44ab_rmz0">
         <w:r>
           <w:rPr>
             <w:rStyle w:val="Hyperlink"/>
@@ -1463,7 +2168,7 @@
         </w:numPr>
         <w:spacing w:after="80"/>
       </w:pPr>
-      <w:hyperlink w:history="1" r:id="rIdonbvzjvk40-x5zwdb00w9">
+      <w:hyperlink w:history="1" r:id="rIdhruzmkgqkvu-425qkyl64">
         <w:r>
           <w:rPr>
             <w:rStyle w:val="Hyperlink"/>
@@ -1483,7 +2188,7 @@
         </w:numPr>
         <w:spacing w:after="80"/>
       </w:pPr>
-      <w:hyperlink w:history="1" r:id="rId02vur0jjolx-q29wjj0ej">
+      <w:hyperlink w:history="1" r:id="rId0yjz867p0j5wdtt3htf1x">
         <w:r>
           <w:rPr>
             <w:rStyle w:val="Hyperlink"/>
@@ -1503,7 +2208,7 @@
         </w:numPr>
         <w:spacing w:after="80"/>
       </w:pPr>
-      <w:hyperlink w:history="1" r:id="rIdii0klu5ftnjvnwnlpbtnj">
+      <w:hyperlink w:history="1" r:id="rIdlpi64durwki8ebwdzkxgm">
         <w:r>
           <w:rPr>
             <w:rStyle w:val="Hyperlink"/>
@@ -1523,7 +2228,7 @@
         </w:numPr>
         <w:spacing w:after="80"/>
       </w:pPr>
-      <w:hyperlink w:history="1" r:id="rIdko4b7j3m2auaett2uzoks">
+      <w:hyperlink w:history="1" r:id="rIdypg4cjeluxszhwjdqubr8">
         <w:r>
           <w:rPr>
             <w:rStyle w:val="Hyperlink"/>
@@ -1543,7 +2248,7 @@
         </w:numPr>
         <w:spacing w:after="80"/>
       </w:pPr>
-      <w:hyperlink w:history="1" r:id="rIdexztntln5watm6qh52gcf">
+      <w:hyperlink w:history="1" r:id="rId0fooj8jbkexlbbhjfmgiv">
         <w:r>
           <w:rPr>
             <w:rStyle w:val="Hyperlink"/>
@@ -1563,7 +2268,7 @@
         </w:numPr>
         <w:spacing w:after="80"/>
       </w:pPr>
-      <w:hyperlink w:history="1" r:id="rIdp3b9pmgqb_bmor_0sxy0t">
+      <w:hyperlink w:history="1" r:id="rIdp-o0f3amlbi6xj33k9oyp">
         <w:r>
           <w:rPr>
             <w:rStyle w:val="Hyperlink"/>
@@ -1583,7 +2288,7 @@
         </w:numPr>
         <w:spacing w:after="80"/>
       </w:pPr>
-      <w:hyperlink w:history="1" r:id="rIdwstvn0967ghdxd5xmq-1h">
+      <w:hyperlink w:history="1" r:id="rIdll3pbhdqi2lq5v0t32rfa">
         <w:r>
           <w:rPr>
             <w:rStyle w:val="Hyperlink"/>
@@ -1603,7 +2308,7 @@
         </w:numPr>
         <w:spacing w:after="80"/>
       </w:pPr>
-      <w:hyperlink w:history="1" r:id="rIdjoltysxra_mb3az-sds1m">
+      <w:hyperlink w:history="1" r:id="rIdppfuj9c4xorpolz1xuqbm">
         <w:r>
           <w:rPr>
             <w:rStyle w:val="Hyperlink"/>
@@ -1623,7 +2328,7 @@
         </w:numPr>
         <w:spacing w:after="80"/>
       </w:pPr>
-      <w:hyperlink w:history="1" r:id="rIdwidpqtwfi3v40xdhp9ljn">
+      <w:hyperlink w:history="1" r:id="rIdbr8z3qjsimvthkwbaaa0y">
         <w:r>
           <w:rPr>
             <w:rStyle w:val="Hyperlink"/>
@@ -1631,6 +2336,66 @@
             <w:u w:val="single"/>
           </w:rPr>
           <w:t xml:space="preserve">Sizing Estimator (web tool)</w:t>
+        </w:r>
+      </w:hyperlink>
+    </w:p>
+    <w:p>
+      <w:pPr>
+        <w:pStyle w:val="ListParagraph"/>
+        <w:numPr>
+          <w:ilvl w:val="0"/>
+          <w:numId w:val="3"/>
+        </w:numPr>
+        <w:spacing w:after="80"/>
+      </w:pPr>
+      <w:hyperlink w:history="1" r:id="rIdy38q0aysxkcstpotoqhfh">
+        <w:r>
+          <w:rPr>
+            <w:rStyle w:val="Hyperlink"/>
+            <w:color w:val="0563C1"/>
+            <w:u w:val="single"/>
+          </w:rPr>
+          <w:t xml:space="preserve">KB 315975 — Aria Ops for Logs load balancer incompatible with NSX DFW</w:t>
+        </w:r>
+      </w:hyperlink>
+    </w:p>
+    <w:p>
+      <w:pPr>
+        <w:pStyle w:val="ListParagraph"/>
+        <w:numPr>
+          <w:ilvl w:val="0"/>
+          <w:numId w:val="3"/>
+        </w:numPr>
+        <w:spacing w:after="80"/>
+      </w:pPr>
+      <w:hyperlink w:history="1" r:id="rId2ugexrbsldfwj8esvewpa">
+        <w:r>
+          <w:rPr>
+            <w:rStyle w:val="Hyperlink"/>
+            <w:color w:val="0563C1"/>
+            <w:u w:val="single"/>
+          </w:rPr>
+          <w:t xml:space="preserve">KB 318494 — Receiving multiple inactive host alerts (truncate ingestion_hosts_v3)</w:t>
+        </w:r>
+      </w:hyperlink>
+    </w:p>
+    <w:p>
+      <w:pPr>
+        <w:pStyle w:val="ListParagraph"/>
+        <w:numPr>
+          <w:ilvl w:val="0"/>
+          <w:numId w:val="3"/>
+        </w:numPr>
+        <w:spacing w:after="80"/>
+      </w:pPr>
+      <w:hyperlink w:history="1" r:id="rIdtz8uhpcbxyl7hnpwg5sks">
+        <w:r>
+          <w:rPr>
+            <w:rStyle w:val="Hyperlink"/>
+            <w:color w:val="0563C1"/>
+            <w:u w:val="single"/>
+          </w:rPr>
+          <w:t xml:space="preserve">KB 92151 — Multiple Inactive ESXi Host Email Alerts</w:t>
         </w:r>
       </w:hyperlink>
     </w:p>

</xml_diff>